<commit_message>
feat: update Ecommerece with welcome message
</commit_message>
<xml_diff>
--- a/my-app/src/Movie_Maniac_List/New Microsoft Word Document.docx
+++ b/my-app/src/Movie_Maniac_List/New Microsoft Word Document.docx
@@ -11,7 +11,15 @@
         </w:numPr>
       </w:pPr>
       <w:r>
-        <w:t xml:space="preserve">How to add fontFamily in react </w:t>
+        <w:t xml:space="preserve">How to add </w:t>
+      </w:r>
+      <w:proofErr w:type="spellStart"/>
+      <w:r>
+        <w:t>fontFamily</w:t>
+      </w:r>
+      <w:proofErr w:type="spellEnd"/>
+      <w:r>
+        <w:t xml:space="preserve"> in react </w:t>
       </w:r>
     </w:p>
     <w:p>
@@ -37,6 +45,7 @@
       <w:r>
         <w:t xml:space="preserve">Paste the file in bellow path (in this </w:t>
       </w:r>
+      <w:proofErr w:type="spellStart"/>
       <w:r>
         <w:rPr>
           <w:rFonts w:ascii="Consolas" w:eastAsia="Times New Roman" w:hAnsi="Consolas" w:cs="Times New Roman"/>
@@ -48,6 +57,7 @@
         </w:rPr>
         <w:t>Montserrat.woff</w:t>
       </w:r>
+      <w:proofErr w:type="spellEnd"/>
       <w:r>
         <w:rPr>
           <w:rFonts w:ascii="Consolas" w:eastAsia="Times New Roman" w:hAnsi="Consolas" w:cs="Times New Roman"/>
@@ -84,8 +94,21 @@
           <w:szCs w:val="21"/>
           <w14:ligatures w14:val="none"/>
         </w:rPr>
-        <w:t>"./assets/fonts/Montserrat.woff</w:t>
-      </w:r>
+        <w:t>"./assets/fonts/</w:t>
+      </w:r>
+      <w:proofErr w:type="spellStart"/>
+      <w:r>
+        <w:rPr>
+          <w:rFonts w:ascii="Consolas" w:eastAsia="Times New Roman" w:hAnsi="Consolas" w:cs="Times New Roman"/>
+          <w:color w:val="A5D6FF"/>
+          <w:kern w:val="0"/>
+          <w:sz w:val="21"/>
+          <w:szCs w:val="21"/>
+          <w14:ligatures w14:val="none"/>
+        </w:rPr>
+        <w:t>Montserrat.woff</w:t>
+      </w:r>
+      <w:proofErr w:type="spellEnd"/>
     </w:p>
     <w:p>
       <w:pPr>
@@ -187,7 +210,23 @@
         <w:pStyle w:val="ListParagraph"/>
       </w:pPr>
       <w:r>
-        <w:t xml:space="preserve">It’s create blur effect which can be helpful to give a glossy looks </w:t>
+        <w:t xml:space="preserve">It’s </w:t>
+      </w:r>
+      <w:proofErr w:type="gramStart"/>
+      <w:r>
+        <w:t>create</w:t>
+      </w:r>
+      <w:proofErr w:type="gramEnd"/>
+      <w:r>
+        <w:t xml:space="preserve"> blur effect which can be helpful to give a </w:t>
+      </w:r>
+      <w:proofErr w:type="gramStart"/>
+      <w:r>
+        <w:t>glossy looks</w:t>
+      </w:r>
+      <w:proofErr w:type="gramEnd"/>
+      <w:r>
+        <w:t xml:space="preserve"> </w:t>
       </w:r>
     </w:p>
     <w:p>
@@ -251,8 +290,13 @@
     <w:p>
       <w:r>
         <w:tab/>
-        <w:t>Just like bellow .</w:t>
-      </w:r>
+        <w:t xml:space="preserve">Just like </w:t>
+      </w:r>
+      <w:proofErr w:type="gramStart"/>
+      <w:r>
+        <w:t>bellow .</w:t>
+      </w:r>
+      <w:proofErr w:type="gramEnd"/>
       <w:r>
         <w:tab/>
       </w:r>
@@ -306,7 +350,15 @@
         </w:numPr>
       </w:pPr>
       <w:r>
-        <w:t>Using “Lodsh” for sorting</w:t>
+        <w:t>Using “</w:t>
+      </w:r>
+      <w:proofErr w:type="spellStart"/>
+      <w:r>
+        <w:t>Lodsh</w:t>
+      </w:r>
+      <w:proofErr w:type="spellEnd"/>
+      <w:r>
+        <w:t>” for sorting</w:t>
       </w:r>
     </w:p>
     <w:p>
@@ -317,6 +369,7 @@
           <w:numId w:val="3"/>
         </w:numPr>
       </w:pPr>
+      <w:proofErr w:type="spellStart"/>
       <w:r>
         <w:rPr>
           <w:b/>
@@ -325,6 +378,7 @@
         <w:lastRenderedPageBreak/>
         <w:t>Lodash</w:t>
       </w:r>
+      <w:proofErr w:type="spellEnd"/>
       <w:r>
         <w:rPr>
           <w:b/>
@@ -348,12 +402,14 @@
         <w:t xml:space="preserve">To use </w:t>
       </w:r>
       <w:hyperlink r:id="rId9" w:tgtFrame="_blank" w:history="1">
+        <w:proofErr w:type="spellStart"/>
         <w:r>
           <w:rPr>
             <w:rStyle w:val="Hyperlink"/>
           </w:rPr>
           <w:t>Lodash</w:t>
         </w:r>
+        <w:proofErr w:type="spellEnd"/>
       </w:hyperlink>
       <w:r>
         <w:t>, you must install the library via a package manager, import it into your JavaScript file using the global underscore (_</w:t>
@@ -370,8 +426,13 @@
           <w:numId w:val="3"/>
         </w:numPr>
       </w:pPr>
-      <w:r>
-        <w:t xml:space="preserve">Intall it via </w:t>
+      <w:proofErr w:type="spellStart"/>
+      <w:r>
+        <w:t>Intall</w:t>
+      </w:r>
+      <w:proofErr w:type="spellEnd"/>
+      <w:r>
+        <w:t xml:space="preserve"> it via </w:t>
       </w:r>
     </w:p>
     <w:p>
@@ -383,13 +444,31 @@
           <w:bCs/>
         </w:rPr>
       </w:pPr>
-      <w:r>
-        <w:rPr>
-          <w:b/>
-          <w:bCs/>
-        </w:rPr>
-        <w:t>npm install lodash</w:t>
-      </w:r>
+      <w:proofErr w:type="spellStart"/>
+      <w:r>
+        <w:rPr>
+          <w:b/>
+          <w:bCs/>
+        </w:rPr>
+        <w:t>npm</w:t>
+      </w:r>
+      <w:proofErr w:type="spellEnd"/>
+      <w:r>
+        <w:rPr>
+          <w:b/>
+          <w:bCs/>
+        </w:rPr>
+        <w:t xml:space="preserve"> install </w:t>
+      </w:r>
+      <w:proofErr w:type="spellStart"/>
+      <w:r>
+        <w:rPr>
+          <w:b/>
+          <w:bCs/>
+        </w:rPr>
+        <w:t>lodash</w:t>
+      </w:r>
+      <w:proofErr w:type="spellEnd"/>
     </w:p>
     <w:p>
       <w:pPr>
@@ -448,21 +527,57 @@
           <w:b/>
           <w:bCs/>
         </w:rPr>
-        <w:t>In our project we use Lodsh</w:t>
-      </w:r>
-      <w:r>
-        <w:rPr>
-          <w:b/>
-          <w:bCs/>
-        </w:rPr>
-        <w:t xml:space="preserve"> to use it’s  </w:t>
-      </w:r>
-      <w:r>
-        <w:rPr>
-          <w:b/>
-          <w:bCs/>
-        </w:rPr>
-        <w:t xml:space="preserve">orderby </w:t>
+        <w:t xml:space="preserve">In our project we use </w:t>
+      </w:r>
+      <w:proofErr w:type="spellStart"/>
+      <w:r>
+        <w:rPr>
+          <w:b/>
+          <w:bCs/>
+        </w:rPr>
+        <w:t>Lodsh</w:t>
+      </w:r>
+      <w:proofErr w:type="spellEnd"/>
+      <w:r>
+        <w:rPr>
+          <w:b/>
+          <w:bCs/>
+        </w:rPr>
+        <w:t xml:space="preserve"> to use </w:t>
+      </w:r>
+      <w:proofErr w:type="spellStart"/>
+      <w:proofErr w:type="gramStart"/>
+      <w:r>
+        <w:rPr>
+          <w:b/>
+          <w:bCs/>
+        </w:rPr>
+        <w:t>it’s</w:t>
+      </w:r>
+      <w:proofErr w:type="spellEnd"/>
+      <w:r>
+        <w:rPr>
+          <w:b/>
+          <w:bCs/>
+        </w:rPr>
+        <w:t xml:space="preserve">  </w:t>
+      </w:r>
+      <w:proofErr w:type="spellStart"/>
+      <w:r>
+        <w:rPr>
+          <w:b/>
+          <w:bCs/>
+        </w:rPr>
+        <w:t>orderby</w:t>
+      </w:r>
+      <w:proofErr w:type="spellEnd"/>
+      <w:proofErr w:type="gramEnd"/>
+      <w:r>
+        <w:rPr>
+          <w:b/>
+          <w:bCs/>
+        </w:rPr>
+        <w:t xml:space="preserve"> </w:t>
       </w:r>
       <w:r>
         <w:rPr>
@@ -520,7 +635,23 @@
           <w:b/>
           <w:bCs/>
         </w:rPr>
-        <w:t xml:space="preserve"> is bellow. </w:t>
+        <w:t xml:space="preserve"> is </w:t>
+      </w:r>
+      <w:proofErr w:type="spellStart"/>
+      <w:r>
+        <w:rPr>
+          <w:b/>
+          <w:bCs/>
+        </w:rPr>
+        <w:t>bellow</w:t>
+      </w:r>
+      <w:proofErr w:type="spellEnd"/>
+      <w:r>
+        <w:rPr>
+          <w:b/>
+          <w:bCs/>
+        </w:rPr>
+        <w:t xml:space="preserve">. </w:t>
       </w:r>
     </w:p>
     <w:p>
@@ -555,6 +686,7 @@
           <w14:ligatures w14:val="none"/>
         </w:rPr>
       </w:pPr>
+      <w:proofErr w:type="gramStart"/>
       <w:r>
         <w:rPr>
           <w:rFonts w:ascii="Consolas" w:eastAsia="Times New Roman" w:hAnsi="Consolas" w:cs="Courier New"/>
@@ -562,7 +694,79 @@
           <w:kern w:val="0"/>
           <w14:ligatures w14:val="none"/>
         </w:rPr>
-        <w:t>_.orderBy(Collection, [ iteratees ],  [ orders ]);</w:t>
+        <w:t>_.</w:t>
+      </w:r>
+      <w:proofErr w:type="spellStart"/>
+      <w:r>
+        <w:rPr>
+          <w:rFonts w:ascii="Consolas" w:eastAsia="Times New Roman" w:hAnsi="Consolas" w:cs="Courier New"/>
+          <w:spacing w:val="2"/>
+          <w:kern w:val="0"/>
+          <w14:ligatures w14:val="none"/>
+        </w:rPr>
+        <w:t>orderBy</w:t>
+      </w:r>
+      <w:proofErr w:type="spellEnd"/>
+      <w:proofErr w:type="gramEnd"/>
+      <w:r>
+        <w:rPr>
+          <w:rFonts w:ascii="Consolas" w:eastAsia="Times New Roman" w:hAnsi="Consolas" w:cs="Courier New"/>
+          <w:spacing w:val="2"/>
+          <w:kern w:val="0"/>
+          <w14:ligatures w14:val="none"/>
+        </w:rPr>
+        <w:t xml:space="preserve">(Collection, [ </w:t>
+      </w:r>
+      <w:proofErr w:type="spellStart"/>
+      <w:proofErr w:type="gramStart"/>
+      <w:r>
+        <w:rPr>
+          <w:rFonts w:ascii="Consolas" w:eastAsia="Times New Roman" w:hAnsi="Consolas" w:cs="Courier New"/>
+          <w:spacing w:val="2"/>
+          <w:kern w:val="0"/>
+          <w14:ligatures w14:val="none"/>
+        </w:rPr>
+        <w:t>iteratees</w:t>
+      </w:r>
+      <w:proofErr w:type="spellEnd"/>
+      <w:r>
+        <w:rPr>
+          <w:rFonts w:ascii="Consolas" w:eastAsia="Times New Roman" w:hAnsi="Consolas" w:cs="Courier New"/>
+          <w:spacing w:val="2"/>
+          <w:kern w:val="0"/>
+          <w14:ligatures w14:val="none"/>
+        </w:rPr>
+        <w:t xml:space="preserve"> ]</w:t>
+      </w:r>
+      <w:proofErr w:type="gramEnd"/>
+      <w:r>
+        <w:rPr>
+          <w:rFonts w:ascii="Consolas" w:eastAsia="Times New Roman" w:hAnsi="Consolas" w:cs="Courier New"/>
+          <w:spacing w:val="2"/>
+          <w:kern w:val="0"/>
+          <w14:ligatures w14:val="none"/>
+        </w:rPr>
+        <w:t xml:space="preserve">,  [ </w:t>
+      </w:r>
+      <w:proofErr w:type="gramStart"/>
+      <w:r>
+        <w:rPr>
+          <w:rFonts w:ascii="Consolas" w:eastAsia="Times New Roman" w:hAnsi="Consolas" w:cs="Courier New"/>
+          <w:spacing w:val="2"/>
+          <w:kern w:val="0"/>
+          <w14:ligatures w14:val="none"/>
+        </w:rPr>
+        <w:t>orders ]</w:t>
+      </w:r>
+      <w:proofErr w:type="gramEnd"/>
+      <w:r>
+        <w:rPr>
+          <w:rFonts w:ascii="Consolas" w:eastAsia="Times New Roman" w:hAnsi="Consolas" w:cs="Courier New"/>
+          <w:spacing w:val="2"/>
+          <w:kern w:val="0"/>
+          <w14:ligatures w14:val="none"/>
+        </w:rPr>
+        <w:t>);</w:t>
       </w:r>
     </w:p>
     <w:p>
@@ -625,21 +829,71 @@
           <w:b/>
           <w:bCs/>
         </w:rPr>
-        <w:t xml:space="preserve"> sorting function we use orderby</w:t>
-      </w:r>
-      <w:r>
-        <w:rPr>
-          <w:b/>
-          <w:bCs/>
-        </w:rPr>
-        <w:t xml:space="preserve"> function from loadsh Libary</w:t>
-      </w:r>
-      <w:r>
-        <w:rPr>
-          <w:b/>
-          <w:bCs/>
-        </w:rPr>
-        <w:t xml:space="preserve"> for more understandable , easy written code</w:t>
+        <w:t xml:space="preserve"> sorting function we use </w:t>
+      </w:r>
+      <w:proofErr w:type="spellStart"/>
+      <w:r>
+        <w:rPr>
+          <w:b/>
+          <w:bCs/>
+        </w:rPr>
+        <w:t>orderby</w:t>
+      </w:r>
+      <w:proofErr w:type="spellEnd"/>
+      <w:r>
+        <w:rPr>
+          <w:b/>
+          <w:bCs/>
+        </w:rPr>
+        <w:t xml:space="preserve"> function from </w:t>
+      </w:r>
+      <w:proofErr w:type="spellStart"/>
+      <w:r>
+        <w:rPr>
+          <w:b/>
+          <w:bCs/>
+        </w:rPr>
+        <w:t>loadsh</w:t>
+      </w:r>
+      <w:proofErr w:type="spellEnd"/>
+      <w:r>
+        <w:rPr>
+          <w:b/>
+          <w:bCs/>
+        </w:rPr>
+        <w:t xml:space="preserve"> </w:t>
+      </w:r>
+      <w:proofErr w:type="spellStart"/>
+      <w:r>
+        <w:rPr>
+          <w:b/>
+          <w:bCs/>
+        </w:rPr>
+        <w:t>Libary</w:t>
+      </w:r>
+      <w:proofErr w:type="spellEnd"/>
+      <w:r>
+        <w:rPr>
+          <w:b/>
+          <w:bCs/>
+        </w:rPr>
+        <w:t xml:space="preserve"> for more </w:t>
+      </w:r>
+      <w:proofErr w:type="gramStart"/>
+      <w:r>
+        <w:rPr>
+          <w:b/>
+          <w:bCs/>
+        </w:rPr>
+        <w:t>understandable ,</w:t>
+      </w:r>
+      <w:proofErr w:type="gramEnd"/>
+      <w:r>
+        <w:rPr>
+          <w:b/>
+          <w:bCs/>
+        </w:rPr>
+        <w:t xml:space="preserve"> easy written code</w:t>
       </w:r>
       <w:r>
         <w:rPr>
@@ -683,14 +937,39 @@
           <w:b/>
           <w:bCs/>
         </w:rPr>
-        <w:t>Import lodash</w:t>
-      </w:r>
-      <w:r>
-        <w:rPr>
-          <w:b/>
-          <w:bCs/>
-        </w:rPr>
-        <w:t xml:space="preserve"> (MovieList.jsx)</w:t>
+        <w:t xml:space="preserve">Import </w:t>
+      </w:r>
+      <w:proofErr w:type="spellStart"/>
+      <w:r>
+        <w:rPr>
+          <w:b/>
+          <w:bCs/>
+        </w:rPr>
+        <w:t>lodash</w:t>
+      </w:r>
+      <w:proofErr w:type="spellEnd"/>
+      <w:r>
+        <w:rPr>
+          <w:b/>
+          <w:bCs/>
+        </w:rPr>
+        <w:t xml:space="preserve"> (</w:t>
+      </w:r>
+      <w:proofErr w:type="spellStart"/>
+      <w:r>
+        <w:rPr>
+          <w:b/>
+          <w:bCs/>
+        </w:rPr>
+        <w:t>MovieList.jsx</w:t>
+      </w:r>
+      <w:proofErr w:type="spellEnd"/>
+      <w:r>
+        <w:rPr>
+          <w:b/>
+          <w:bCs/>
+        </w:rPr>
+        <w:t>)</w:t>
       </w:r>
     </w:p>
     <w:p>
@@ -770,7 +1049,48 @@
           <w:b/>
           <w:bCs/>
         </w:rPr>
-        <w:t xml:space="preserve">Using _.groupBy where collection = filteredMovies, </w:t>
+        <w:t xml:space="preserve">Using </w:t>
+      </w:r>
+      <w:proofErr w:type="gramStart"/>
+      <w:r>
+        <w:rPr>
+          <w:b/>
+          <w:bCs/>
+        </w:rPr>
+        <w:t>_.</w:t>
+      </w:r>
+      <w:proofErr w:type="spellStart"/>
+      <w:r>
+        <w:rPr>
+          <w:b/>
+          <w:bCs/>
+        </w:rPr>
+        <w:t>groupBy</w:t>
+      </w:r>
+      <w:proofErr w:type="spellEnd"/>
+      <w:proofErr w:type="gramEnd"/>
+      <w:r>
+        <w:rPr>
+          <w:b/>
+          <w:bCs/>
+        </w:rPr>
+        <w:t xml:space="preserve"> where collection = </w:t>
+      </w:r>
+      <w:proofErr w:type="spellStart"/>
+      <w:r>
+        <w:rPr>
+          <w:b/>
+          <w:bCs/>
+        </w:rPr>
+        <w:t>filteredMovies</w:t>
+      </w:r>
+      <w:proofErr w:type="spellEnd"/>
+      <w:r>
+        <w:rPr>
+          <w:b/>
+          <w:bCs/>
+        </w:rPr>
+        <w:t xml:space="preserve">, </w:t>
       </w:r>
       <w:r>
         <w:rPr>
@@ -806,8 +1126,19 @@
           <w:kern w:val="0"/>
           <w14:ligatures w14:val="none"/>
         </w:rPr>
-        <w:t>=Sort.order</w:t>
-      </w:r>
+        <w:t>=</w:t>
+      </w:r>
+      <w:proofErr w:type="spellStart"/>
+      <w:r>
+        <w:rPr>
+          <w:rFonts w:ascii="Consolas" w:eastAsia="Times New Roman" w:hAnsi="Consolas" w:cs="Courier New"/>
+          <w:spacing w:val="2"/>
+          <w:kern w:val="0"/>
+          <w14:ligatures w14:val="none"/>
+        </w:rPr>
+        <w:t>Sort.order</w:t>
+      </w:r>
+      <w:proofErr w:type="spellEnd"/>
     </w:p>
     <w:p>
       <w:pPr>
@@ -859,6 +1190,25 @@
           </wp:inline>
         </w:drawing>
       </w:r>
+    </w:p>
+    <w:p>
+      <w:pPr>
+        <w:pStyle w:val="ListParagraph"/>
+        <w:ind w:left="1080"/>
+        <w:rPr>
+          <w:noProof/>
+        </w:rPr>
+      </w:pPr>
+    </w:p>
+    <w:p>
+      <w:pPr>
+        <w:pStyle w:val="ListParagraph"/>
+        <w:ind w:left="1080"/>
+        <w:rPr>
+          <w:b/>
+          <w:bCs/>
+        </w:rPr>
+      </w:pPr>
     </w:p>
     <w:sectPr>
       <w:pgSz w:w="12240" w:h="15840"/>
@@ -1802,6 +2152,7 @@
   <w:style w:type="character" w:default="1" w:styleId="DefaultParagraphFont">
     <w:name w:val="Default Paragraph Font"/>
     <w:uiPriority w:val="1"/>
+    <w:semiHidden/>
     <w:unhideWhenUsed/>
   </w:style>
   <w:style w:type="table" w:default="1" w:styleId="TableNormal">

</xml_diff>